<commit_message>
Bring docs to par with as-built system; fix fetch_prices default window (recorded sources now default to full range, not 2015-2021)
</commit_message>
<xml_diff>
--- a/docs/Portfolio_Risk_Budgeting_Plan.docx
+++ b/docs/Portfolio_Risk_Budgeting_Plan.docx
@@ -45,7 +45,7 @@
         <w:rPr>
           <w:sz w:val="20"/>
         </w:rPr>
-        <w:t>Generated 2026-05-31  ·  branch claude/portfolio-risk-budgeting-plan-ahVMe</w:t>
+        <w:t>Generated 2026-06-13  ·  branch claude/portfolio-risk-budgeting-plan-ahVMe</w:t>
       </w:r>
     </w:p>
     <w:p>
@@ -107,13 +107,82 @@
           <w:b/>
           <w:i/>
         </w:rPr>
-        <w:t>In build.</w:t>
+        <w:t>Built and operational</w:t>
       </w:r>
       <w:r>
         <w:rPr>
           <w:i/>
         </w:rPr>
-        <w:t xml:space="preserve"> Wave 0 (foundation), Wave 0.5 (core extension), and Wave 1 (data, simulation, risk/return models incl. Black-Litterman, optimizers, diversification/factor-RB/HRP) are implemented, integrated, and green (428 passed, 6 optional cross-checks skipped offline; ruff + mypy clean). Wave 2 (backtester, analytics, dynamic allocation) and Wave 3 (API/dashboard, integration) are next. This document is the single source of truth that every build agent reads first.</w:t>
+        <w:t xml:space="preserve"> (all waves complete; 707 passed / 6 optional cross-check skips; ruff + mypy clean). The full pipeline runs end-to-end: data (synthetic, CSV, Tiingo, Shiller, gold, and a live 5-source daily deep-history panel 1968→present) → risk/return models (incl. Black-Litterman) → optimizers (ERC/risk-budget via CCD/cvxpy/scipy, GMV, MSR, Efficient-MSR, ensemble, conditional) → diversification (ENB, min-torsion, MDP, max-ENB, HRP) → walk-forward backtester (no look-ahead, costs) with a </w:t>
+      </w:r>
+      <w:r>
+        <w:rPr>
+          <w:b/>
+          <w:i/>
+        </w:rPr>
+        <w:t>volatility-targeting overlay</w:t>
+      </w:r>
+      <w:r>
+        <w:rPr>
+          <w:i/>
+        </w:rPr>
+        <w:t xml:space="preserve"> (</w:t>
+      </w:r>
+      <w:r>
+        <w:rPr>
+          <w:rFonts w:ascii="Consolas" w:hAnsi="Consolas"/>
+          <w:i/>
+          <w:sz w:val="19"/>
+        </w:rPr>
+        <w:t>target_volatility</w:t>
+      </w:r>
+      <w:r>
+        <w:rPr>
+          <w:i/>
+        </w:rPr>
+        <w:t xml:space="preserve">, 252-day daily vol) → analytics (Cornish-Fisher VaR/CVaR, drawdown, attribution, summary_stats) → reporting (single-strategy + multi-strategy comparison HTML) → API / dashboard / CLI, all driven by one </w:t>
+      </w:r>
+      <w:r>
+        <w:rPr>
+          <w:rFonts w:ascii="Consolas" w:hAnsi="Consolas"/>
+          <w:i/>
+          <w:sz w:val="19"/>
+        </w:rPr>
+        <w:t>StrategySpec</w:t>
+      </w:r>
+      <w:r>
+        <w:rPr>
+          <w:i/>
+        </w:rPr>
+        <w:t xml:space="preserve"> + registry. Post-build additions beyond the original waves: vol targeting, comparison reports, deep-history + live-updating data providers, dividend-adjusted total-return S&amp;P (validated against Shiller's ie_data.xls, median dev 0.02%). Examples: </w:t>
+      </w:r>
+      <w:r>
+        <w:rPr>
+          <w:rFonts w:ascii="Consolas" w:hAnsi="Consolas"/>
+          <w:i/>
+          <w:sz w:val="19"/>
+        </w:rPr>
+        <w:t>examples/*.py</w:t>
+      </w:r>
+      <w:r>
+        <w:rPr>
+          <w:i/>
+        </w:rPr>
+        <w:t xml:space="preserve">; sources: </w:t>
+      </w:r>
+      <w:r>
+        <w:rPr>
+          <w:rFonts w:ascii="Consolas" w:hAnsi="Consolas"/>
+          <w:i/>
+          <w:sz w:val="19"/>
+        </w:rPr>
+        <w:t>docs/daily-data-sources.md</w:t>
+      </w:r>
+      <w:r>
+        <w:rPr>
+          <w:i/>
+        </w:rPr>
+        <w:t>. This document remains the architectural source of truth; §1–§12 describe the as-built design.</w:t>
       </w:r>
     </w:p>
     <w:p>

</xml_diff>